<commit_message>
작업정보 판넬 분할을 Ecs.ini 로 - JOB_PANEL_SPLIT(0 자동/1 가로/2 세로), JOB_PANEL_DETAIL_W/H, 세로 분할선도 끌기
Co-Authored-By: Claude Fable 5.1 <noreply@anthropic.com>
</commit_message>
<xml_diff>
--- a/적용_20260930/2026-10-01_적용안내서_추가분.docx
+++ b/적용_20260930/2026-10-01_적용안내서_추가분.docx
@@ -2490,6 +2490,224 @@
         <w:t>작업정보 판넬(왼쪽 아래)도 바꿨다 : 작업구분 탭 줄과 [자동 갱신] 을 없앴고(자동 갱신은 켜진 채 숨김), [완료처리] 는 상세 칸 맨 위 오른쪽으로, 목록|상세 사이 분할선은 끌어서 폭을 바꿀 수 있다. 이 판넬의 컨트롤도 Ecs.rc 의 IDD_PANEL_JOB 에 있어 리소스 편집기에서 고칠 수 있다 (왼쪽 칸은 리소스 좌표 그대로, 오른쪽 머리줄은 리소스의 상대 위치를 유지).</w:t>
       </w:r>
     </w:p>
+    <w:tbl>
+      <w:tblPr>
+        <w:tblStyle w:val="TableGrid"/>
+        <w:tblW w:type="auto" w:w="0"/>
+        <w:jc w:val="center"/>
+        <w:tblLook w:firstColumn="1" w:firstRow="1" w:lastColumn="0" w:lastRow="0" w:noHBand="0" w:noVBand="1" w:val="04A0"/>
+      </w:tblPr>
+      <w:tblGrid>
+        <w:gridCol w:w="3324"/>
+        <w:gridCol w:w="3324"/>
+        <w:gridCol w:w="3324"/>
+      </w:tblGrid>
+      <w:tr>
+        <w:tc>
+          <w:tcPr>
+            <w:tcW w:type="dxa" w:w="2551"/>
+            <w:shd w:val="clear" w:color="auto" w:fill="1E2761"/>
+          </w:tcPr>
+          <w:p>
+            <w:pPr>
+              <w:jc w:val="center"/>
+            </w:pPr>
+            <w:r/>
+            <w:r>
+              <w:rPr>
+                <w:b/>
+                <w:color w:val="FFFFFF"/>
+                <w:sz w:val="18"/>
+              </w:rPr>
+              <w:t>Ecs.ini [DISPLAY]</w:t>
+            </w:r>
+          </w:p>
+        </w:tc>
+        <w:tc>
+          <w:tcPr>
+            <w:tcW w:type="dxa" w:w="1417"/>
+            <w:shd w:val="clear" w:color="auto" w:fill="1E2761"/>
+          </w:tcPr>
+          <w:p>
+            <w:pPr>
+              <w:jc w:val="center"/>
+            </w:pPr>
+            <w:r/>
+            <w:r>
+              <w:rPr>
+                <w:b/>
+                <w:color w:val="FFFFFF"/>
+                <w:sz w:val="18"/>
+              </w:rPr>
+              <w:t>값</w:t>
+            </w:r>
+          </w:p>
+        </w:tc>
+        <w:tc>
+          <w:tcPr>
+            <w:tcW w:type="dxa" w:w="5102"/>
+            <w:shd w:val="clear" w:color="auto" w:fill="1E2761"/>
+          </w:tcPr>
+          <w:p>
+            <w:pPr>
+              <w:jc w:val="center"/>
+            </w:pPr>
+            <w:r/>
+            <w:r>
+              <w:rPr>
+                <w:b/>
+                <w:color w:val="FFFFFF"/>
+                <w:sz w:val="18"/>
+              </w:rPr>
+              <w:t>뜻</w:t>
+            </w:r>
+          </w:p>
+        </w:tc>
+      </w:tr>
+      <w:tr>
+        <w:tc>
+          <w:tcPr>
+            <w:tcW w:type="dxa" w:w="2551"/>
+          </w:tcPr>
+          <w:p>
+            <w:r/>
+            <w:r>
+              <w:rPr>
+                <w:sz w:val="18"/>
+              </w:rPr>
+              <w:t>JOB_PANEL_SPLIT</w:t>
+            </w:r>
+          </w:p>
+        </w:tc>
+        <w:tc>
+          <w:tcPr>
+            <w:tcW w:type="dxa" w:w="1417"/>
+          </w:tcPr>
+          <w:p>
+            <w:r/>
+            <w:r>
+              <w:rPr>
+                <w:sz w:val="18"/>
+              </w:rPr>
+              <w:t>0 / 1 / 2</w:t>
+            </w:r>
+          </w:p>
+        </w:tc>
+        <w:tc>
+          <w:tcPr>
+            <w:tcW w:type="dxa" w:w="5102"/>
+          </w:tcPr>
+          <w:p>
+            <w:r/>
+            <w:r>
+              <w:rPr>
+                <w:sz w:val="18"/>
+              </w:rPr>
+              <w:t>0 자동(판넬 폭 620px 미만이면 세로) / 1 가로(상세 칸 오른쪽) / 2 세로(상세 칸 아래)</w:t>
+            </w:r>
+          </w:p>
+        </w:tc>
+      </w:tr>
+      <w:tr>
+        <w:tc>
+          <w:tcPr>
+            <w:tcW w:type="dxa" w:w="2551"/>
+          </w:tcPr>
+          <w:p>
+            <w:r/>
+            <w:r>
+              <w:rPr>
+                <w:sz w:val="18"/>
+              </w:rPr>
+              <w:t>JOB_PANEL_DETAIL_W</w:t>
+            </w:r>
+          </w:p>
+        </w:tc>
+        <w:tc>
+          <w:tcPr>
+            <w:tcW w:type="dxa" w:w="1417"/>
+          </w:tcPr>
+          <w:p>
+            <w:r/>
+            <w:r>
+              <w:rPr>
+                <w:sz w:val="18"/>
+              </w:rPr>
+              <w:t>px</w:t>
+            </w:r>
+          </w:p>
+        </w:tc>
+        <w:tc>
+          <w:tcPr>
+            <w:tcW w:type="dxa" w:w="5102"/>
+          </w:tcPr>
+          <w:p>
+            <w:r/>
+            <w:r>
+              <w:rPr>
+                <w:sz w:val="18"/>
+              </w:rPr>
+              <w:t>가로일 때 상세 칸 폭 (0 = 38%)</w:t>
+            </w:r>
+          </w:p>
+        </w:tc>
+      </w:tr>
+      <w:tr>
+        <w:tc>
+          <w:tcPr>
+            <w:tcW w:type="dxa" w:w="2551"/>
+          </w:tcPr>
+          <w:p>
+            <w:r/>
+            <w:r>
+              <w:rPr>
+                <w:sz w:val="18"/>
+              </w:rPr>
+              <w:t>JOB_PANEL_DETAIL_H</w:t>
+            </w:r>
+          </w:p>
+        </w:tc>
+        <w:tc>
+          <w:tcPr>
+            <w:tcW w:type="dxa" w:w="1417"/>
+          </w:tcPr>
+          <w:p>
+            <w:r/>
+            <w:r>
+              <w:rPr>
+                <w:sz w:val="18"/>
+              </w:rPr>
+              <w:t>px</w:t>
+            </w:r>
+          </w:p>
+        </w:tc>
+        <w:tc>
+          <w:tcPr>
+            <w:tcW w:type="dxa" w:w="5102"/>
+          </w:tcPr>
+          <w:p>
+            <w:r/>
+            <w:r>
+              <w:rPr>
+                <w:sz w:val="18"/>
+              </w:rPr>
+              <w:t>세로일 때 상세 칸 높이 (0 = 178)</w:t>
+            </w:r>
+          </w:p>
+        </w:tc>
+      </w:tr>
+    </w:tbl>
+    <w:p/>
+    <w:p>
+      <w:r>
+        <w:rPr>
+          <w:b w:val="0"/>
+          <w:i w:val="0"/>
+          <w:sz w:val="20"/>
+        </w:rPr>
+        <w:t>분할선(가로면 세로줄, 세로면 가로줄)을 마우스로 끌면 그 크기가 우선하고, 다시 띄우면 ini 값으로 돌아온다. ini 를 저장하면 다음 크기 변경 때 반영된다.</w:t>
+      </w:r>
+    </w:p>
     <w:p>
       <w:pPr>
         <w:pStyle w:val="Heading1"/>

</xml_diff>